<commit_message>
Add improvements to loan agreement template
</commit_message>
<xml_diff>
--- a/templates/LOAN_AGREEMENT_Template.docx
+++ b/templates/LOAN_AGREEMENT_Template.docx
@@ -804,106 +804,7 @@
         <w:jc w:val="both"/>
       </w:pPr>
       <w:r>
-        <w:t>This Capital Loan Agreement is entered into as an extension of the original note executed on August 13</w:t>
-      </w:r>
-      <w:r>
-        <w:rPr>
-          <w:vertAlign w:val="superscript"/>
-        </w:rPr>
-        <w:t>th</w:t>
-      </w:r>
-      <w:r>
-        <w:t>, 2025,</w:t>
-      </w:r>
-      <w:r>
-        <w:t xml:space="preserve"> and of the prior extension agreement executed on September 19</w:t>
-      </w:r>
-      <w:r>
-        <w:rPr>
-          <w:vertAlign w:val="superscript"/>
-        </w:rPr>
-        <w:t>th</w:t>
-      </w:r>
-      <w:r>
-        <w:t>,</w:t>
-      </w:r>
-      <w:r>
-        <w:t xml:space="preserve"> October 15</w:t>
-      </w:r>
-      <w:r>
-        <w:rPr>
-          <w:vertAlign w:val="superscript"/>
-        </w:rPr>
-        <w:t>th</w:t>
-      </w:r>
-      <w:r>
-        <w:t>,</w:t>
-      </w:r>
-      <w:r>
-        <w:t xml:space="preserve"> </w:t>
-      </w:r>
-      <w:r>
-        <w:t xml:space="preserve"> November 26</w:t>
-      </w:r>
-      <w:r>
-        <w:rPr>
-          <w:vertAlign w:val="superscript"/>
-        </w:rPr>
-        <w:t>th</w:t>
-      </w:r>
-      <w:r>
-        <w:t xml:space="preserve">, </w:t>
-      </w:r>
-      <w:r>
-        <w:t>December 23</w:t>
-      </w:r>
-      <w:r>
-        <w:rPr>
-          <w:vertAlign w:val="superscript"/>
-        </w:rPr>
-        <w:t>rd</w:t>
-      </w:r>
-      <w:r>
-        <w:t xml:space="preserve">, </w:t>
-      </w:r>
-      <w:r>
-        <w:t>2025,</w:t>
-      </w:r>
-      <w:r>
-        <w:t xml:space="preserve"> January 20</w:t>
-      </w:r>
-      <w:r>
-        <w:rPr>
-          <w:vertAlign w:val="superscript"/>
-        </w:rPr>
-        <w:t>th</w:t>
-      </w:r>
-      <w:r>
-        <w:t>, 2026</w:t>
-      </w:r>
-      <w:r>
-        <w:t>, February 17</w:t>
-      </w:r>
-      <w:r>
-        <w:rPr>
-          <w:vertAlign w:val="superscript"/>
-        </w:rPr>
-        <w:t>th</w:t>
-      </w:r>
-      <w:r>
-        <w:t>, 2026, March 17</w:t>
-      </w:r>
-      <w:r>
-        <w:rPr>
-          <w:vertAlign w:val="superscript"/>
-        </w:rPr>
-        <w:t>th</w:t>
-      </w:r>
-      <w:r>
-        <w:t>, 2026</w:t>
-      </w:r>
-      <w:r>
-        <w:t>,</w:t>
+        <w:t xml:space="preserve">This Capital Loan Agreement is entered into as an extension of the original note executed </w:t>
       </w:r>
       <w:r>
         <w:t>{{DATE_HISTORY}}</w:t>
@@ -918,10 +819,7 @@
         <w:t xml:space="preserve"> by and between the parties hereto, under which the Lender extended a loan in the principal amount of</w:t>
       </w:r>
       <w:r>
-        <w:t xml:space="preserve"> </w:t>
-      </w:r>
-      <w:r>
-        <w:t>{{WRITTEN_LOAN_AMOUNT}}</w:t>
+        <w:t xml:space="preserve"> {{WRITTEN_LOAN_AMOUNT}}</w:t>
       </w:r>
       <w:r>
         <w:t xml:space="preserve"> ($</w:t>
@@ -1771,36 +1669,72 @@
         <w:t>(</w:t>
       </w:r>
       <w:r>
+        <w:t>{{INTEREST_PERCENT</w:t>
+      </w:r>
+      <w:proofErr w:type="gramStart"/>
+      <w:r>
+        <w:t>}}</w:t>
+      </w:r>
+      <w:r>
+        <w:rPr>
+          <w:b/>
+        </w:rPr>
+        <w:t>%</w:t>
+      </w:r>
+      <w:proofErr w:type="gramEnd"/>
+      <w:r>
+        <w:rPr>
+          <w:b/>
+        </w:rPr>
+        <w:t>)</w:t>
+      </w:r>
+      <w:r>
+        <w:t>, totaling</w:t>
+      </w:r>
+      <w:r>
+        <w:t xml:space="preserve"> {{WRITTEN_CALCULATED_INTEREST_AMOUNT}}</w:t>
+      </w:r>
+      <w:r>
+        <w:t xml:space="preserve"> </w:t>
+      </w:r>
+      <w:r>
+        <w:rPr>
+          <w:b/>
+        </w:rPr>
+        <w:t>($</w:t>
+      </w:r>
+      <w:r>
+        <w:rPr>
+          <w:b/>
+        </w:rPr>
+        <w:t>{{CALCULATED_INTEREST_AMOUNT}}</w:t>
+      </w:r>
+      <w:r>
+        <w:rPr>
+          <w:b/>
+        </w:rPr>
+        <w:t>)</w:t>
+      </w:r>
+      <w:r>
+        <w:t xml:space="preserve">. The total repayment amount is </w:t>
+      </w:r>
+      <w:r>
         <w:t>{{</w:t>
       </w:r>
       <w:r>
-        <w:t>INTEREST_PERCENT</w:t>
-      </w:r>
-      <w:proofErr w:type="gramStart"/>
+        <w:rPr>
+          <w:b/>
+        </w:rPr>
+        <w:t>WRITTEN_TOTAL_LOAN_AMOUNT</w:t>
+      </w:r>
       <w:r>
         <w:t>}}</w:t>
       </w:r>
       <w:r>
-        <w:rPr>
-          <w:b/>
-        </w:rPr>
-        <w:t>%</w:t>
-      </w:r>
-      <w:proofErr w:type="gramEnd"/>
-      <w:r>
-        <w:rPr>
-          <w:b/>
-        </w:rPr>
-        <w:t>)</w:t>
-      </w:r>
-      <w:r>
-        <w:t>, totaling</w:t>
-      </w:r>
-      <w:r>
-        <w:t xml:space="preserve"> {{WRITTEN_CALCULATED_INTEREST_AMOUNT}}</w:t>
-      </w:r>
-      <w:r>
-        <w:t xml:space="preserve"> </w:t>
+        <w:t xml:space="preserve"> </w:t>
+      </w:r>
+      <w:r>
+        <w:t xml:space="preserve">Dollars </w:t>
       </w:r>
       <w:r>
         <w:rPr>
@@ -1812,66 +1746,19 @@
         <w:rPr>
           <w:b/>
         </w:rPr>
-        <w:t>{{CALCULATED_INTEREST_AMOUNT}}</w:t>
-      </w:r>
-      <w:r>
-        <w:rPr>
-          <w:b/>
-        </w:rPr>
-        <w:t>)</w:t>
-      </w:r>
-      <w:r>
-        <w:t xml:space="preserve">. The total repayment amount is </w:t>
-      </w:r>
-      <w:r>
-        <w:t>{{</w:t>
-      </w:r>
-      <w:r>
-        <w:rPr>
-          <w:b/>
-        </w:rPr>
-        <w:t>WRITTEN_</w:t>
-      </w:r>
-      <w:r>
-        <w:rPr>
-          <w:b/>
-        </w:rPr>
-        <w:t>TOTAL_LOAN_AMOUNT</w:t>
-      </w:r>
-      <w:r>
-        <w:t>}}</w:t>
-      </w:r>
-      <w:r>
-        <w:t xml:space="preserve"> </w:t>
-      </w:r>
-      <w:r>
-        <w:t xml:space="preserve">Dollars </w:t>
-      </w:r>
-      <w:r>
-        <w:rPr>
-          <w:b/>
-        </w:rPr>
-        <w:t>($</w:t>
-      </w:r>
-      <w:r>
-        <w:rPr>
-          <w:b/>
-        </w:rPr>
         <w:t>{{TOTAL_LOAN_AMOUNT}}</w:t>
       </w:r>
       <w:r>
         <w:t>).</w:t>
       </w:r>
-    </w:p>
-    <w:p>
-      <w:pPr>
-        <w:pStyle w:val="BodyText"/>
-        <w:spacing w:before="1" w:line="259" w:lineRule="auto"/>
-        <w:ind w:left="360" w:right="231"/>
-        <w:jc w:val="both"/>
-      </w:pPr>
-      <w:r>
-        <w:t>{{LOAN_AGREEMENT_DETAILS}}</w:t>
+      <w:r>
+        <w:t xml:space="preserve"> </w:t>
+      </w:r>
+      <w:r>
+        <w:br/>
+      </w:r>
+      <w:r>
+        <w:t>The full loan shall be repaid within thirty (30) days, with a maturity date of June 21st, 2026.</w:t>
       </w:r>
     </w:p>
     <w:p>
@@ -2136,7 +2023,7 @@
         <w:rPr>
           <w:spacing w:val="-4"/>
         </w:rPr>
-        <w:t xml:space="preserve">, 2026, the borrower shall incur a Monthly Interest Rate of four percent (4%), equivalent to an annual rate of forty-eight percent (48%), on the matured, unpaid amount. </w:t>
+        <w:t xml:space="preserve">, the borrower shall incur a Monthly Interest Rate of four percent (4%), equivalent to an annual rate of forty-eight percent (48%), on the matured, unpaid amount. </w:t>
       </w:r>
       <w:r>
         <w:t>This penalty will recur monthly until the loan is fully satisfied. If maturity</w:t>

</xml_diff>

<commit_message>
Add Ocando template for loan agreement
</commit_message>
<xml_diff>
--- a/templates/LOAN_AGREEMENT_Template.docx
+++ b/templates/LOAN_AGREEMENT_Template.docx
@@ -1235,6 +1235,9 @@
       <w:r>
         <w:t>{{WRITTEN_LOAN_AMOUNT}}</w:t>
       </w:r>
+      <w:r>
+        <w:t xml:space="preserve"> Dollars</w:t>
+      </w:r>
     </w:p>
     <w:p>
       <w:pPr>
@@ -1243,6 +1246,7 @@
         <w:ind w:left="360"/>
         <w:rPr>
           <w:b w:val="0"/>
+          <w:spacing w:val="-2"/>
         </w:rPr>
       </w:pPr>
       <w:bookmarkStart w:id="5" w:name="($80,000.00)_(“Principal”)."/>
@@ -1291,26 +1295,42 @@
     </w:p>
     <w:p>
       <w:pPr>
-        <w:pStyle w:val="BodyText"/>
-        <w:spacing w:before="49"/>
-      </w:pPr>
-    </w:p>
-    <w:p>
-      <w:pPr>
-        <w:pStyle w:val="BodyText"/>
-        <w:spacing w:before="49"/>
-      </w:pPr>
-    </w:p>
-    <w:p>
-      <w:pPr>
-        <w:pStyle w:val="BodyText"/>
-        <w:spacing w:before="49"/>
-      </w:pPr>
-    </w:p>
-    <w:p>
-      <w:pPr>
-        <w:pStyle w:val="BodyText"/>
-        <w:spacing w:before="49"/>
+        <w:pStyle w:val="Heading1"/>
+        <w:spacing w:before="23"/>
+        <w:ind w:left="360"/>
+        <w:rPr>
+          <w:b w:val="0"/>
+        </w:rPr>
+      </w:pPr>
+    </w:p>
+    <w:p>
+      <w:pPr>
+        <w:pStyle w:val="Heading1"/>
+        <w:spacing w:before="23"/>
+        <w:ind w:left="360"/>
+        <w:rPr>
+          <w:b w:val="0"/>
+        </w:rPr>
+      </w:pPr>
+    </w:p>
+    <w:p>
+      <w:pPr>
+        <w:pStyle w:val="Heading1"/>
+        <w:spacing w:before="23"/>
+        <w:ind w:left="360"/>
+        <w:rPr>
+          <w:b w:val="0"/>
+        </w:rPr>
+      </w:pPr>
+    </w:p>
+    <w:p>
+      <w:pPr>
+        <w:pStyle w:val="Heading1"/>
+        <w:spacing w:before="23"/>
+        <w:ind w:left="360"/>
+        <w:rPr>
+          <w:b w:val="0"/>
+        </w:rPr>
       </w:pPr>
     </w:p>
     <w:p>
@@ -1334,6 +1354,7 @@
           <w:b/>
           <w:sz w:val="24"/>
         </w:rPr>
+        <w:lastRenderedPageBreak/>
         <w:t>Interest</w:t>
       </w:r>
       <w:r>
@@ -1535,7 +1556,10 @@
         <w:t xml:space="preserve"> </w:t>
       </w:r>
       <w:r>
-        <w:t xml:space="preserve">{{WRITTEN_INTEREST_PERCENT}} </w:t>
+        <w:t>{{WRITTEN_INTEREST_PERCENT}}</w:t>
+      </w:r>
+      <w:r>
+        <w:t xml:space="preserve"> percent </w:t>
       </w:r>
       <w:r>
         <w:rPr>
@@ -1568,6 +1592,9 @@
       </w:r>
       <w:r>
         <w:t xml:space="preserve"> {{WRITTEN_CALCULATED_INTEREST_AMOUNT}}</w:t>
+      </w:r>
+      <w:r>
+        <w:t xml:space="preserve"> Dollars</w:t>
       </w:r>
       <w:r>
         <w:t xml:space="preserve"> </w:t>
@@ -2065,1550 +2092,6 @@
     <w:p>
       <w:pPr>
         <w:pStyle w:val="BodyText"/>
-        <w:spacing w:before="1" w:line="259" w:lineRule="auto"/>
-        <w:ind w:right="231"/>
-        <w:jc w:val="both"/>
-      </w:pPr>
-    </w:p>
-    <w:p>
-      <w:pPr>
-        <w:pStyle w:val="BodyText"/>
-        <w:numPr>
-          <w:ilvl w:val="0"/>
-          <w:numId w:val="1"/>
-        </w:numPr>
-        <w:spacing w:before="1" w:line="259" w:lineRule="auto"/>
-        <w:ind w:right="231"/>
-        <w:jc w:val="both"/>
-        <w:rPr>
-          <w:b/>
-          <w:bCs/>
-        </w:rPr>
-      </w:pPr>
-      <w:r>
-        <w:rPr>
-          <w:b/>
-          <w:bCs/>
-        </w:rPr>
-        <w:t>Transition to Investment Fund</w:t>
-      </w:r>
-    </w:p>
-    <w:p>
-      <w:pPr>
-        <w:pStyle w:val="BodyText"/>
-        <w:spacing w:before="1" w:line="259" w:lineRule="auto"/>
-        <w:ind w:left="600" w:right="231"/>
-      </w:pPr>
-      <w:r>
-        <w:t>The</w:t>
-      </w:r>
-      <w:r>
-        <w:rPr>
-          <w:spacing w:val="-5"/>
-        </w:rPr>
-        <w:t xml:space="preserve"> </w:t>
-      </w:r>
-      <w:r>
-        <w:t>lender</w:t>
-      </w:r>
-      <w:r>
-        <w:rPr>
-          <w:spacing w:val="-5"/>
-        </w:rPr>
-        <w:t xml:space="preserve"> </w:t>
-      </w:r>
-      <w:r>
-        <w:t>acknowledges</w:t>
-      </w:r>
-      <w:r>
-        <w:rPr>
-          <w:spacing w:val="-5"/>
-        </w:rPr>
-        <w:t xml:space="preserve"> </w:t>
-      </w:r>
-      <w:r>
-        <w:t>and</w:t>
-      </w:r>
-      <w:r>
-        <w:rPr>
-          <w:spacing w:val="-7"/>
-        </w:rPr>
-        <w:t xml:space="preserve"> </w:t>
-      </w:r>
-      <w:r>
-        <w:t>agrees</w:t>
-      </w:r>
-      <w:r>
-        <w:rPr>
-          <w:spacing w:val="-4"/>
-        </w:rPr>
-        <w:t xml:space="preserve"> </w:t>
-      </w:r>
-      <w:r>
-        <w:t>that</w:t>
-      </w:r>
-      <w:r>
-        <w:rPr>
-          <w:spacing w:val="-6"/>
-        </w:rPr>
-        <w:t xml:space="preserve"> </w:t>
-      </w:r>
-      <w:r>
-        <w:t>this</w:t>
-      </w:r>
-      <w:r>
-        <w:rPr>
-          <w:spacing w:val="-5"/>
-        </w:rPr>
-        <w:t xml:space="preserve"> </w:t>
-      </w:r>
-      <w:r>
-        <w:t>transaction</w:t>
-      </w:r>
-      <w:r>
-        <w:rPr>
-          <w:spacing w:val="-7"/>
-        </w:rPr>
-        <w:t xml:space="preserve"> </w:t>
-      </w:r>
-      <w:r>
-        <w:t>represents a</w:t>
-      </w:r>
-      <w:r>
-        <w:rPr>
-          <w:spacing w:val="-6"/>
-        </w:rPr>
-        <w:t xml:space="preserve"> </w:t>
-      </w:r>
-      <w:r>
-        <w:t>phase</w:t>
-      </w:r>
-      <w:r>
-        <w:rPr>
-          <w:spacing w:val="-5"/>
-        </w:rPr>
-        <w:t xml:space="preserve"> </w:t>
-      </w:r>
-      <w:r>
-        <w:t>of</w:t>
-      </w:r>
-      <w:r>
-        <w:rPr>
-          <w:spacing w:val="-4"/>
-        </w:rPr>
-        <w:t xml:space="preserve"> </w:t>
-      </w:r>
-      <w:r>
-        <w:t>a</w:t>
-      </w:r>
-      <w:r>
-        <w:rPr>
-          <w:spacing w:val="-6"/>
-        </w:rPr>
-        <w:t xml:space="preserve"> </w:t>
-      </w:r>
-      <w:r>
-        <w:t>broader investment</w:t>
-      </w:r>
-      <w:r>
-        <w:rPr>
-          <w:spacing w:val="-14"/>
-        </w:rPr>
-        <w:t xml:space="preserve"> </w:t>
-      </w:r>
-      <w:r>
-        <w:t>relationship.</w:t>
-      </w:r>
-      <w:r>
-        <w:rPr>
-          <w:spacing w:val="-14"/>
-        </w:rPr>
-        <w:t xml:space="preserve"> </w:t>
-      </w:r>
-      <w:r>
-        <w:t>Upon</w:t>
-      </w:r>
-      <w:r>
-        <w:rPr>
-          <w:spacing w:val="-13"/>
-        </w:rPr>
-        <w:t xml:space="preserve"> </w:t>
-      </w:r>
-      <w:r>
-        <w:t>receipt</w:t>
-      </w:r>
-      <w:r>
-        <w:rPr>
-          <w:spacing w:val="-14"/>
-        </w:rPr>
-        <w:t xml:space="preserve"> </w:t>
-      </w:r>
-      <w:r>
-        <w:t>of</w:t>
-      </w:r>
-      <w:r>
-        <w:rPr>
-          <w:spacing w:val="-13"/>
-        </w:rPr>
-        <w:t xml:space="preserve"> </w:t>
-      </w:r>
-      <w:r>
-        <w:t>the</w:t>
-      </w:r>
-      <w:r>
-        <w:rPr>
-          <w:spacing w:val="-14"/>
-        </w:rPr>
-        <w:t xml:space="preserve"> </w:t>
-      </w:r>
-      <w:r>
-        <w:t>full</w:t>
-      </w:r>
-      <w:r>
-        <w:rPr>
-          <w:spacing w:val="-13"/>
-        </w:rPr>
-        <w:t xml:space="preserve"> </w:t>
-      </w:r>
-      <w:r>
-        <w:t>repayment</w:t>
-      </w:r>
-      <w:r>
-        <w:rPr>
-          <w:spacing w:val="-14"/>
-        </w:rPr>
-        <w:t xml:space="preserve"> </w:t>
-      </w:r>
-      <w:r>
-        <w:t>amount</w:t>
-      </w:r>
-      <w:r>
-        <w:rPr>
-          <w:spacing w:val="-14"/>
-        </w:rPr>
-        <w:t xml:space="preserve"> </w:t>
-      </w:r>
-      <w:r>
-        <w:t>of</w:t>
-      </w:r>
-      <w:r>
-        <w:rPr>
-          <w:spacing w:val="-13"/>
-        </w:rPr>
-        <w:t xml:space="preserve"> </w:t>
-      </w:r>
-      <w:r>
-        <w:t>{{</w:t>
-      </w:r>
-      <w:r>
-        <w:rPr>
-          <w:b/>
-        </w:rPr>
-        <w:t>WRITTEN_TOTAL_LOAN_AMOUNT</w:t>
-      </w:r>
-      <w:r>
-        <w:t xml:space="preserve">}} </w:t>
-      </w:r>
-      <w:r>
-        <w:rPr>
-          <w:b/>
-        </w:rPr>
-        <w:t>(${{TOTAL_LOAN_AMOUNT}}</w:t>
-      </w:r>
-      <w:r>
-        <w:t>).</w:t>
-      </w:r>
-      <w:r>
-        <w:t xml:space="preserve">, the principal amount of the funds, </w:t>
-      </w:r>
-      <w:r>
-        <w:t xml:space="preserve">{{WRITTEN_LOAN_AMOUNT}} (${{LOAN_AMOUNT}}) </w:t>
-      </w:r>
-      <w:r>
-        <w:t>shall</w:t>
-      </w:r>
-      <w:r>
-        <w:rPr>
-          <w:spacing w:val="-4"/>
-        </w:rPr>
-        <w:t xml:space="preserve"> </w:t>
-      </w:r>
-      <w:r>
-        <w:t>be</w:t>
-      </w:r>
-      <w:r>
-        <w:rPr>
-          <w:spacing w:val="-7"/>
-        </w:rPr>
-        <w:t xml:space="preserve"> </w:t>
-      </w:r>
-      <w:r>
-        <w:t>applied</w:t>
-      </w:r>
-      <w:r>
-        <w:rPr>
-          <w:spacing w:val="-9"/>
-        </w:rPr>
-        <w:t xml:space="preserve"> </w:t>
-      </w:r>
-      <w:r>
-        <w:t>as</w:t>
-      </w:r>
-      <w:r>
-        <w:rPr>
-          <w:spacing w:val="-7"/>
-        </w:rPr>
-        <w:t xml:space="preserve"> </w:t>
-      </w:r>
-      <w:r>
-        <w:t>a</w:t>
-      </w:r>
-      <w:r>
-        <w:rPr>
-          <w:spacing w:val="-13"/>
-        </w:rPr>
-        <w:t xml:space="preserve"> </w:t>
-      </w:r>
-      <w:r>
-        <w:t>Capital</w:t>
-      </w:r>
-      <w:r>
-        <w:rPr>
-          <w:spacing w:val="-8"/>
-        </w:rPr>
-        <w:t xml:space="preserve"> </w:t>
-      </w:r>
-      <w:r>
-        <w:t>Contribution</w:t>
-      </w:r>
-      <w:r>
-        <w:rPr>
-          <w:spacing w:val="-5"/>
-        </w:rPr>
-        <w:t xml:space="preserve"> </w:t>
-      </w:r>
-      <w:r>
-        <w:t>to</w:t>
-      </w:r>
-      <w:r>
-        <w:rPr>
-          <w:spacing w:val="-10"/>
-        </w:rPr>
-        <w:t xml:space="preserve"> </w:t>
-      </w:r>
-      <w:r>
-        <w:t>a</w:t>
-      </w:r>
-      <w:r>
-        <w:rPr>
-          <w:spacing w:val="-8"/>
-        </w:rPr>
-        <w:t xml:space="preserve"> </w:t>
-      </w:r>
-      <w:r>
-        <w:t>newly</w:t>
-      </w:r>
-      <w:r>
-        <w:rPr>
-          <w:spacing w:val="-12"/>
-        </w:rPr>
-        <w:t xml:space="preserve"> </w:t>
-      </w:r>
-      <w:r>
-        <w:t>formed</w:t>
-      </w:r>
-      <w:r>
-        <w:rPr>
-          <w:spacing w:val="-9"/>
-        </w:rPr>
-        <w:t xml:space="preserve"> </w:t>
-      </w:r>
-      <w:r>
-        <w:t>investment</w:t>
-      </w:r>
-      <w:r>
-        <w:rPr>
-          <w:spacing w:val="-8"/>
-        </w:rPr>
-        <w:t xml:space="preserve"> </w:t>
-      </w:r>
-      <w:r>
-        <w:t>fund</w:t>
-      </w:r>
-      <w:r>
-        <w:rPr>
-          <w:spacing w:val="-2"/>
-        </w:rPr>
-        <w:t xml:space="preserve"> </w:t>
-      </w:r>
-      <w:r>
-        <w:rPr>
-          <w:b/>
-        </w:rPr>
-        <w:t xml:space="preserve">(“Fund”) </w:t>
-      </w:r>
-      <w:r>
-        <w:t>structured as a Limited Liability Company.</w:t>
-      </w:r>
-    </w:p>
-    <w:p>
-      <w:pPr>
-        <w:pStyle w:val="BodyText"/>
-        <w:spacing w:before="1" w:line="259" w:lineRule="auto"/>
-        <w:ind w:left="600" w:right="231"/>
-      </w:pPr>
-    </w:p>
-    <w:p>
-      <w:pPr>
-        <w:pStyle w:val="BodyText"/>
-        <w:spacing w:before="1" w:line="259" w:lineRule="auto"/>
-        <w:ind w:left="600" w:right="231"/>
-        <w:jc w:val="both"/>
-      </w:pPr>
-      <w:r>
-        <w:t>Within</w:t>
-      </w:r>
-      <w:r>
-        <w:rPr>
-          <w:spacing w:val="-7"/>
-        </w:rPr>
-        <w:t xml:space="preserve"> </w:t>
-      </w:r>
-      <w:r>
-        <w:t>this</w:t>
-      </w:r>
-      <w:r>
-        <w:rPr>
-          <w:spacing w:val="-5"/>
-        </w:rPr>
-        <w:t xml:space="preserve"> </w:t>
-      </w:r>
-      <w:r>
-        <w:t>Fund</w:t>
-      </w:r>
-      <w:r>
-        <w:rPr>
-          <w:spacing w:val="-7"/>
-        </w:rPr>
-        <w:t xml:space="preserve"> </w:t>
-      </w:r>
-      <w:r>
-        <w:t>Structure,</w:t>
-      </w:r>
-      <w:r>
-        <w:rPr>
-          <w:spacing w:val="-5"/>
-        </w:rPr>
-        <w:t xml:space="preserve"> </w:t>
-      </w:r>
-      <w:r>
-        <w:t>the Lender</w:t>
-      </w:r>
-      <w:r>
-        <w:rPr>
-          <w:spacing w:val="-9"/>
-        </w:rPr>
-        <w:t xml:space="preserve"> </w:t>
-      </w:r>
-      <w:r>
-        <w:t>shall</w:t>
-      </w:r>
-      <w:r>
-        <w:rPr>
-          <w:spacing w:val="-6"/>
-        </w:rPr>
-        <w:t xml:space="preserve"> </w:t>
-      </w:r>
-      <w:r>
-        <w:t xml:space="preserve">(a) </w:t>
-      </w:r>
-      <w:r>
-        <w:rPr>
-          <w:b/>
-        </w:rPr>
-        <w:t>maintain</w:t>
-      </w:r>
-      <w:r>
-        <w:rPr>
-          <w:b/>
-          <w:spacing w:val="-5"/>
-        </w:rPr>
-        <w:t xml:space="preserve"> </w:t>
-      </w:r>
-      <w:r>
-        <w:rPr>
-          <w:b/>
-        </w:rPr>
-        <w:t>an</w:t>
-      </w:r>
-      <w:r>
-        <w:rPr>
-          <w:b/>
-          <w:spacing w:val="-5"/>
-        </w:rPr>
-        <w:t xml:space="preserve"> </w:t>
-      </w:r>
-      <w:r>
-        <w:rPr>
-          <w:b/>
-        </w:rPr>
-        <w:t>active</w:t>
-      </w:r>
-      <w:r>
-        <w:rPr>
-          <w:b/>
-          <w:spacing w:val="-7"/>
-        </w:rPr>
-        <w:t xml:space="preserve"> </w:t>
-      </w:r>
-      <w:r>
-        <w:rPr>
-          <w:b/>
-        </w:rPr>
-        <w:t>role</w:t>
-      </w:r>
-      <w:r>
-        <w:rPr>
-          <w:b/>
-          <w:spacing w:val="-7"/>
-        </w:rPr>
-        <w:t xml:space="preserve"> </w:t>
-      </w:r>
-      <w:r>
-        <w:rPr>
-          <w:b/>
-        </w:rPr>
-        <w:t>in</w:t>
-      </w:r>
-      <w:r>
-        <w:rPr>
-          <w:b/>
-          <w:spacing w:val="-5"/>
-        </w:rPr>
-        <w:t xml:space="preserve"> </w:t>
-      </w:r>
-      <w:r>
-        <w:rPr>
-          <w:b/>
-        </w:rPr>
-        <w:t>the</w:t>
-      </w:r>
-      <w:r>
-        <w:rPr>
-          <w:b/>
-          <w:spacing w:val="-7"/>
-        </w:rPr>
-        <w:t xml:space="preserve"> </w:t>
-      </w:r>
-      <w:r>
-        <w:rPr>
-          <w:b/>
-        </w:rPr>
-        <w:t>creation</w:t>
-      </w:r>
-      <w:r>
-        <w:rPr>
-          <w:b/>
-          <w:spacing w:val="-5"/>
-        </w:rPr>
-        <w:t xml:space="preserve"> </w:t>
-      </w:r>
-      <w:r>
-        <w:rPr>
-          <w:b/>
-        </w:rPr>
-        <w:t>of</w:t>
-      </w:r>
-      <w:r>
-        <w:rPr>
-          <w:b/>
-          <w:spacing w:val="-7"/>
-        </w:rPr>
-        <w:t xml:space="preserve"> </w:t>
-      </w:r>
-      <w:r>
-        <w:rPr>
-          <w:b/>
-        </w:rPr>
-        <w:t>the</w:t>
-      </w:r>
-      <w:r>
-        <w:rPr>
-          <w:b/>
-          <w:spacing w:val="-7"/>
-        </w:rPr>
-        <w:t xml:space="preserve"> </w:t>
-      </w:r>
-      <w:r>
-        <w:rPr>
-          <w:b/>
-        </w:rPr>
-        <w:t xml:space="preserve">Fund, </w:t>
-      </w:r>
-      <w:r>
-        <w:rPr>
-          <w:spacing w:val="-2"/>
-        </w:rPr>
-        <w:t>and</w:t>
-      </w:r>
-      <w:r>
-        <w:rPr>
-          <w:spacing w:val="-7"/>
-        </w:rPr>
-        <w:t xml:space="preserve"> </w:t>
-      </w:r>
-      <w:r>
-        <w:rPr>
-          <w:spacing w:val="-2"/>
-        </w:rPr>
-        <w:t>(b)</w:t>
-      </w:r>
-      <w:r>
-        <w:rPr>
-          <w:spacing w:val="-3"/>
-        </w:rPr>
-        <w:t xml:space="preserve"> </w:t>
-      </w:r>
-      <w:r>
-        <w:rPr>
-          <w:b/>
-          <w:spacing w:val="-2"/>
-        </w:rPr>
-        <w:t>participate</w:t>
-      </w:r>
-      <w:r>
-        <w:rPr>
-          <w:b/>
-          <w:spacing w:val="-7"/>
-        </w:rPr>
-        <w:t xml:space="preserve"> </w:t>
-      </w:r>
-      <w:r>
-        <w:rPr>
-          <w:b/>
-          <w:spacing w:val="-2"/>
-        </w:rPr>
-        <w:t>as</w:t>
-      </w:r>
-      <w:r>
-        <w:rPr>
-          <w:b/>
-          <w:spacing w:val="-7"/>
-        </w:rPr>
-        <w:t xml:space="preserve"> </w:t>
-      </w:r>
-      <w:r>
-        <w:rPr>
-          <w:b/>
-          <w:spacing w:val="-2"/>
-        </w:rPr>
-        <w:t>a Limited</w:t>
-      </w:r>
-      <w:r>
-        <w:rPr>
-          <w:b/>
-          <w:spacing w:val="-5"/>
-        </w:rPr>
-        <w:t xml:space="preserve"> </w:t>
-      </w:r>
-      <w:r>
-        <w:rPr>
-          <w:b/>
-          <w:spacing w:val="-2"/>
-        </w:rPr>
-        <w:t xml:space="preserve">Partner </w:t>
-      </w:r>
-      <w:r>
-        <w:rPr>
-          <w:spacing w:val="-2"/>
-        </w:rPr>
-        <w:t>through</w:t>
-      </w:r>
-      <w:r>
-        <w:rPr>
-          <w:spacing w:val="-7"/>
-        </w:rPr>
-        <w:t xml:space="preserve"> </w:t>
-      </w:r>
-      <w:r>
-        <w:rPr>
-          <w:spacing w:val="-2"/>
-        </w:rPr>
-        <w:t>its</w:t>
-      </w:r>
-      <w:r>
-        <w:rPr>
-          <w:spacing w:val="-5"/>
-        </w:rPr>
-        <w:t xml:space="preserve"> </w:t>
-      </w:r>
-      <w:r>
-        <w:rPr>
-          <w:spacing w:val="-2"/>
-        </w:rPr>
-        <w:t>initial</w:t>
-      </w:r>
-      <w:r>
-        <w:rPr>
-          <w:spacing w:val="-6"/>
-        </w:rPr>
-        <w:t xml:space="preserve"> </w:t>
-      </w:r>
-      <w:r>
-        <w:rPr>
-          <w:spacing w:val="-2"/>
-        </w:rPr>
-        <w:t>capital contribution</w:t>
-      </w:r>
-      <w:r>
-        <w:rPr>
-          <w:spacing w:val="-7"/>
-        </w:rPr>
-        <w:t xml:space="preserve"> </w:t>
-      </w:r>
-      <w:r>
-        <w:rPr>
-          <w:spacing w:val="-2"/>
-        </w:rPr>
-        <w:t>and</w:t>
-      </w:r>
-      <w:r>
-        <w:rPr>
-          <w:spacing w:val="-7"/>
-        </w:rPr>
-        <w:t xml:space="preserve"> </w:t>
-      </w:r>
-      <w:r>
-        <w:rPr>
-          <w:spacing w:val="-2"/>
-        </w:rPr>
-        <w:t>in</w:t>
-      </w:r>
-      <w:r>
-        <w:rPr>
-          <w:spacing w:val="-7"/>
-        </w:rPr>
-        <w:t xml:space="preserve"> </w:t>
-      </w:r>
-      <w:r>
-        <w:rPr>
-          <w:spacing w:val="-2"/>
-        </w:rPr>
-        <w:t>accordance</w:t>
-      </w:r>
-      <w:r>
-        <w:rPr>
-          <w:spacing w:val="-5"/>
-        </w:rPr>
-        <w:t xml:space="preserve"> </w:t>
-      </w:r>
-      <w:r>
-        <w:rPr>
-          <w:spacing w:val="-2"/>
-        </w:rPr>
-        <w:t xml:space="preserve">with </w:t>
-      </w:r>
-      <w:r>
-        <w:t>the</w:t>
-      </w:r>
-      <w:r>
-        <w:rPr>
-          <w:spacing w:val="-5"/>
-        </w:rPr>
-        <w:t xml:space="preserve"> </w:t>
-      </w:r>
-      <w:r>
-        <w:t>rights,</w:t>
-      </w:r>
-      <w:r>
-        <w:rPr>
-          <w:spacing w:val="-6"/>
-        </w:rPr>
-        <w:t xml:space="preserve"> </w:t>
-      </w:r>
-      <w:r>
-        <w:t>responsibilities,</w:t>
-      </w:r>
-      <w:r>
-        <w:rPr>
-          <w:spacing w:val="-6"/>
-        </w:rPr>
-        <w:t xml:space="preserve"> </w:t>
-      </w:r>
-      <w:r>
-        <w:t>and</w:t>
-      </w:r>
-      <w:r>
-        <w:rPr>
-          <w:spacing w:val="-7"/>
-        </w:rPr>
-        <w:t xml:space="preserve"> </w:t>
-      </w:r>
-      <w:r>
-        <w:t>terms</w:t>
-      </w:r>
-      <w:r>
-        <w:rPr>
-          <w:spacing w:val="-5"/>
-        </w:rPr>
-        <w:t xml:space="preserve"> </w:t>
-      </w:r>
-      <w:r>
-        <w:t>outlined</w:t>
-      </w:r>
-      <w:r>
-        <w:rPr>
-          <w:spacing w:val="-7"/>
-        </w:rPr>
-        <w:t xml:space="preserve"> </w:t>
-      </w:r>
-      <w:r>
-        <w:t>in</w:t>
-      </w:r>
-      <w:r>
-        <w:rPr>
-          <w:spacing w:val="-7"/>
-        </w:rPr>
-        <w:t xml:space="preserve"> </w:t>
-      </w:r>
-      <w:r>
-        <w:t>the</w:t>
-      </w:r>
-      <w:r>
-        <w:rPr>
-          <w:spacing w:val="-5"/>
-        </w:rPr>
-        <w:t xml:space="preserve"> </w:t>
-      </w:r>
-      <w:r>
-        <w:t>Fund’s</w:t>
-      </w:r>
-      <w:r>
-        <w:rPr>
-          <w:spacing w:val="-5"/>
-        </w:rPr>
-        <w:t xml:space="preserve"> </w:t>
-      </w:r>
-      <w:r>
-        <w:t>Operating</w:t>
-      </w:r>
-      <w:r>
-        <w:rPr>
-          <w:spacing w:val="-4"/>
-        </w:rPr>
-        <w:t xml:space="preserve"> </w:t>
-      </w:r>
-      <w:r>
-        <w:t>Agreement</w:t>
-      </w:r>
-      <w:r>
-        <w:rPr>
-          <w:spacing w:val="-7"/>
-        </w:rPr>
-        <w:t xml:space="preserve"> </w:t>
-      </w:r>
-      <w:r>
-        <w:t>and</w:t>
-      </w:r>
-      <w:r>
-        <w:rPr>
-          <w:spacing w:val="-7"/>
-        </w:rPr>
-        <w:t xml:space="preserve"> </w:t>
-      </w:r>
-      <w:r>
-        <w:t>related documents.</w:t>
-      </w:r>
-      <w:r>
-        <w:rPr>
-          <w:spacing w:val="-2"/>
-        </w:rPr>
-        <w:t xml:space="preserve"> </w:t>
-      </w:r>
-      <w:r>
-        <w:t>This</w:t>
-      </w:r>
-      <w:r>
-        <w:rPr>
-          <w:spacing w:val="-6"/>
-        </w:rPr>
-        <w:t xml:space="preserve"> </w:t>
-      </w:r>
-      <w:r>
-        <w:t>capital</w:t>
-      </w:r>
-      <w:r>
-        <w:rPr>
-          <w:spacing w:val="-7"/>
-        </w:rPr>
-        <w:t xml:space="preserve"> </w:t>
-      </w:r>
-      <w:r>
-        <w:t>contribution</w:t>
-      </w:r>
-      <w:r>
-        <w:rPr>
-          <w:spacing w:val="-8"/>
-        </w:rPr>
-        <w:t xml:space="preserve"> </w:t>
-      </w:r>
-      <w:r>
-        <w:t>shall</w:t>
-      </w:r>
-      <w:r>
-        <w:rPr>
-          <w:spacing w:val="-7"/>
-        </w:rPr>
-        <w:t xml:space="preserve"> </w:t>
-      </w:r>
-      <w:r>
-        <w:t>be</w:t>
-      </w:r>
-      <w:r>
-        <w:rPr>
-          <w:spacing w:val="-11"/>
-        </w:rPr>
-        <w:t xml:space="preserve"> </w:t>
-      </w:r>
-      <w:r>
-        <w:t>governed</w:t>
-      </w:r>
-      <w:r>
-        <w:rPr>
-          <w:spacing w:val="-3"/>
-        </w:rPr>
-        <w:t xml:space="preserve"> </w:t>
-      </w:r>
-      <w:r>
-        <w:t>by</w:t>
-      </w:r>
-      <w:r>
-        <w:rPr>
-          <w:spacing w:val="-1"/>
-        </w:rPr>
-        <w:t xml:space="preserve"> </w:t>
-      </w:r>
-      <w:r>
-        <w:t>the</w:t>
-      </w:r>
-      <w:r>
-        <w:rPr>
-          <w:spacing w:val="-6"/>
-        </w:rPr>
-        <w:t xml:space="preserve"> </w:t>
-      </w:r>
-      <w:r>
-        <w:t>terms</w:t>
-      </w:r>
-      <w:r>
-        <w:rPr>
-          <w:spacing w:val="-6"/>
-        </w:rPr>
-        <w:t xml:space="preserve"> </w:t>
-      </w:r>
-      <w:r>
-        <w:t>of</w:t>
-      </w:r>
-      <w:r>
-        <w:rPr>
-          <w:spacing w:val="-5"/>
-        </w:rPr>
-        <w:t xml:space="preserve"> </w:t>
-      </w:r>
-      <w:r>
-        <w:t>the</w:t>
-      </w:r>
-      <w:r>
-        <w:rPr>
-          <w:spacing w:val="-6"/>
-        </w:rPr>
-        <w:t xml:space="preserve"> </w:t>
-      </w:r>
-      <w:r>
-        <w:t>Fund</w:t>
-      </w:r>
-      <w:r>
-        <w:rPr>
-          <w:spacing w:val="-8"/>
-        </w:rPr>
-        <w:t xml:space="preserve"> </w:t>
-      </w:r>
-      <w:r>
-        <w:t>and</w:t>
-      </w:r>
-      <w:r>
-        <w:rPr>
-          <w:spacing w:val="-8"/>
-        </w:rPr>
-        <w:t xml:space="preserve"> </w:t>
-      </w:r>
-      <w:r>
-        <w:t>associated documents are to</w:t>
-      </w:r>
-      <w:r>
-        <w:rPr>
-          <w:spacing w:val="-2"/>
-        </w:rPr>
-        <w:t xml:space="preserve"> </w:t>
-      </w:r>
-      <w:r>
-        <w:t>be finalized and executed by the parties.</w:t>
-      </w:r>
-    </w:p>
-    <w:p>
-      <w:pPr>
-        <w:pStyle w:val="BodyText"/>
-        <w:spacing w:before="1" w:line="259" w:lineRule="auto"/>
-        <w:ind w:right="231"/>
-        <w:jc w:val="both"/>
-      </w:pPr>
-    </w:p>
-    <w:p>
-      <w:pPr>
-        <w:pStyle w:val="BodyText"/>
-        <w:spacing w:before="1" w:line="259" w:lineRule="auto"/>
-        <w:ind w:left="600" w:right="231"/>
-        <w:jc w:val="both"/>
-      </w:pPr>
-      <w:r>
-        <w:t>If,</w:t>
-      </w:r>
-      <w:r>
-        <w:rPr>
-          <w:spacing w:val="-14"/>
-        </w:rPr>
-        <w:t xml:space="preserve"> </w:t>
-      </w:r>
-      <w:r>
-        <w:t>for</w:t>
-      </w:r>
-      <w:r>
-        <w:rPr>
-          <w:spacing w:val="-12"/>
-        </w:rPr>
-        <w:t xml:space="preserve"> </w:t>
-      </w:r>
-      <w:r>
-        <w:t>any</w:t>
-      </w:r>
-      <w:r>
-        <w:rPr>
-          <w:spacing w:val="-13"/>
-        </w:rPr>
-        <w:t xml:space="preserve"> </w:t>
-      </w:r>
-      <w:r>
-        <w:t>reason,</w:t>
-      </w:r>
-      <w:r>
-        <w:rPr>
-          <w:spacing w:val="-12"/>
-        </w:rPr>
-        <w:t xml:space="preserve"> </w:t>
-      </w:r>
-      <w:r>
-        <w:t>the</w:t>
-      </w:r>
-      <w:r>
-        <w:rPr>
-          <w:spacing w:val="-12"/>
-        </w:rPr>
-        <w:t xml:space="preserve"> </w:t>
-      </w:r>
-      <w:r>
-        <w:t>parties</w:t>
-      </w:r>
-      <w:r>
-        <w:rPr>
-          <w:spacing w:val="-12"/>
-        </w:rPr>
-        <w:t xml:space="preserve"> </w:t>
-      </w:r>
-      <w:r>
-        <w:t>do</w:t>
-      </w:r>
-      <w:r>
-        <w:rPr>
-          <w:spacing w:val="-13"/>
-        </w:rPr>
-        <w:t xml:space="preserve"> </w:t>
-      </w:r>
-      <w:r>
-        <w:t>not</w:t>
-      </w:r>
-      <w:r>
-        <w:rPr>
-          <w:spacing w:val="-13"/>
-        </w:rPr>
-        <w:t xml:space="preserve"> </w:t>
-      </w:r>
-      <w:r>
-        <w:t>mutually</w:t>
-      </w:r>
-      <w:r>
-        <w:rPr>
-          <w:spacing w:val="-12"/>
-        </w:rPr>
-        <w:t xml:space="preserve"> </w:t>
-      </w:r>
-      <w:r>
-        <w:t>agree</w:t>
-      </w:r>
-      <w:r>
-        <w:rPr>
-          <w:spacing w:val="-7"/>
-        </w:rPr>
-        <w:t xml:space="preserve"> </w:t>
-      </w:r>
-      <w:r>
-        <w:t>to</w:t>
-      </w:r>
-      <w:r>
-        <w:rPr>
-          <w:spacing w:val="-10"/>
-        </w:rPr>
-        <w:t xml:space="preserve"> </w:t>
-      </w:r>
-      <w:r>
-        <w:t>the</w:t>
-      </w:r>
-      <w:r>
-        <w:rPr>
-          <w:spacing w:val="-12"/>
-        </w:rPr>
-        <w:t xml:space="preserve"> </w:t>
-      </w:r>
-      <w:r>
-        <w:t>final</w:t>
-      </w:r>
-      <w:r>
-        <w:rPr>
-          <w:spacing w:val="-13"/>
-        </w:rPr>
-        <w:t xml:space="preserve"> </w:t>
-      </w:r>
-      <w:r>
-        <w:t>terms</w:t>
-      </w:r>
-      <w:r>
-        <w:rPr>
-          <w:spacing w:val="-12"/>
-        </w:rPr>
-        <w:t xml:space="preserve"> </w:t>
-      </w:r>
-      <w:r>
-        <w:t>of</w:t>
-      </w:r>
-      <w:r>
-        <w:rPr>
-          <w:spacing w:val="-11"/>
-        </w:rPr>
-        <w:t xml:space="preserve"> </w:t>
-      </w:r>
-      <w:r>
-        <w:t>the</w:t>
-      </w:r>
-      <w:r>
-        <w:rPr>
-          <w:spacing w:val="-12"/>
-        </w:rPr>
-        <w:t xml:space="preserve"> </w:t>
-      </w:r>
-      <w:r>
-        <w:t>Fund</w:t>
-      </w:r>
-      <w:r>
-        <w:rPr>
-          <w:spacing w:val="-13"/>
-        </w:rPr>
-        <w:t xml:space="preserve"> </w:t>
-      </w:r>
-      <w:r>
-        <w:t>or</w:t>
-      </w:r>
-      <w:r>
-        <w:rPr>
-          <w:spacing w:val="-12"/>
-        </w:rPr>
-        <w:t xml:space="preserve"> </w:t>
-      </w:r>
-      <w:r>
-        <w:t>the</w:t>
-      </w:r>
-      <w:r>
-        <w:rPr>
-          <w:spacing w:val="-12"/>
-        </w:rPr>
-        <w:t xml:space="preserve"> </w:t>
-      </w:r>
-      <w:r>
-        <w:t>Fund</w:t>
-      </w:r>
-      <w:r>
-        <w:rPr>
-          <w:spacing w:val="-13"/>
-        </w:rPr>
-        <w:t xml:space="preserve"> </w:t>
-      </w:r>
-      <w:r>
-        <w:t>is</w:t>
-      </w:r>
-      <w:r>
-        <w:rPr>
-          <w:spacing w:val="-12"/>
-        </w:rPr>
-        <w:t xml:space="preserve"> </w:t>
-      </w:r>
-      <w:r>
-        <w:t>not formally</w:t>
-      </w:r>
-      <w:r>
-        <w:rPr>
-          <w:spacing w:val="-5"/>
-        </w:rPr>
-        <w:t xml:space="preserve"> </w:t>
-      </w:r>
-      <w:r>
-        <w:t>launched,</w:t>
-      </w:r>
-      <w:r>
-        <w:rPr>
-          <w:spacing w:val="-1"/>
-        </w:rPr>
-        <w:t xml:space="preserve"> </w:t>
-      </w:r>
-      <w:r>
-        <w:t>the</w:t>
-      </w:r>
-      <w:r>
-        <w:rPr>
-          <w:spacing w:val="-5"/>
-        </w:rPr>
-        <w:t xml:space="preserve"> </w:t>
-      </w:r>
-      <w:r>
-        <w:t>full</w:t>
-      </w:r>
-      <w:r>
-        <w:rPr>
-          <w:spacing w:val="-6"/>
-        </w:rPr>
-        <w:t xml:space="preserve"> </w:t>
-      </w:r>
-      <w:r>
-        <w:t>amount</w:t>
-      </w:r>
-      <w:r>
-        <w:rPr>
-          <w:spacing w:val="-7"/>
-        </w:rPr>
-        <w:t xml:space="preserve"> </w:t>
-      </w:r>
-      <w:r>
-        <w:t xml:space="preserve">of </w:t>
-      </w:r>
-      <w:r>
-        <w:rPr>
-          <w:b/>
-        </w:rPr>
-        <w:t>${{LOAN_AMOUNT}}</w:t>
-      </w:r>
-      <w:r>
-        <w:rPr>
-          <w:b/>
-          <w:spacing w:val="-7"/>
-        </w:rPr>
-        <w:t xml:space="preserve"> </w:t>
-      </w:r>
-      <w:r>
-        <w:t>shall</w:t>
-      </w:r>
-      <w:r>
-        <w:rPr>
-          <w:spacing w:val="-1"/>
-        </w:rPr>
-        <w:t xml:space="preserve"> </w:t>
-      </w:r>
-      <w:r>
-        <w:t>be</w:t>
-      </w:r>
-      <w:r>
-        <w:rPr>
-          <w:spacing w:val="-5"/>
-        </w:rPr>
-        <w:t xml:space="preserve"> </w:t>
-      </w:r>
-      <w:r>
-        <w:t>returned</w:t>
-      </w:r>
-      <w:r>
-        <w:rPr>
-          <w:spacing w:val="-6"/>
-        </w:rPr>
-        <w:t xml:space="preserve"> </w:t>
-      </w:r>
-      <w:r>
-        <w:t>to</w:t>
-      </w:r>
-      <w:r>
-        <w:rPr>
-          <w:spacing w:val="-8"/>
-        </w:rPr>
-        <w:t xml:space="preserve"> </w:t>
-      </w:r>
-      <w:r>
-        <w:t>the</w:t>
-      </w:r>
-      <w:r>
-        <w:rPr>
-          <w:spacing w:val="-5"/>
-        </w:rPr>
-        <w:t xml:space="preserve"> </w:t>
-      </w:r>
-      <w:r>
-        <w:t>Lender</w:t>
-      </w:r>
-      <w:r>
-        <w:rPr>
-          <w:spacing w:val="-5"/>
-        </w:rPr>
-        <w:t xml:space="preserve"> </w:t>
-      </w:r>
-      <w:r>
-        <w:t>in</w:t>
-      </w:r>
-      <w:r>
-        <w:rPr>
-          <w:spacing w:val="-12"/>
-        </w:rPr>
-        <w:t xml:space="preserve"> </w:t>
-      </w:r>
-      <w:r>
-        <w:t>full.</w:t>
-      </w:r>
-    </w:p>
-    <w:p>
-      <w:pPr>
-        <w:pStyle w:val="BodyText"/>
-        <w:spacing w:before="1" w:line="259" w:lineRule="auto"/>
-        <w:ind w:right="231"/>
-        <w:jc w:val="both"/>
-      </w:pPr>
-    </w:p>
-    <w:p>
-      <w:pPr>
-        <w:pStyle w:val="BodyText"/>
-        <w:numPr>
-          <w:ilvl w:val="0"/>
-          <w:numId w:val="1"/>
-        </w:numPr>
-        <w:spacing w:before="1" w:line="259" w:lineRule="auto"/>
-        <w:ind w:right="231"/>
-        <w:jc w:val="both"/>
-        <w:rPr>
-          <w:b/>
-          <w:bCs/>
-        </w:rPr>
-      </w:pPr>
-      <w:r>
-        <w:rPr>
-          <w:b/>
-          <w:bCs/>
-        </w:rPr>
-        <w:t>Prepayment</w:t>
-      </w:r>
-      <w:r>
-        <w:rPr>
-          <w:b/>
-          <w:bCs/>
-        </w:rPr>
-        <w:br/>
-      </w:r>
-      <w:r>
-        <w:t>The</w:t>
-      </w:r>
-      <w:r>
-        <w:rPr>
-          <w:spacing w:val="-7"/>
-        </w:rPr>
-        <w:t xml:space="preserve"> </w:t>
-      </w:r>
-      <w:r>
-        <w:t>Borrower may</w:t>
-      </w:r>
-      <w:r>
-        <w:rPr>
-          <w:spacing w:val="-6"/>
-        </w:rPr>
-        <w:t xml:space="preserve"> </w:t>
-      </w:r>
-      <w:r>
-        <w:t>prepay</w:t>
-      </w:r>
-      <w:r>
-        <w:rPr>
-          <w:spacing w:val="-2"/>
-        </w:rPr>
-        <w:t xml:space="preserve"> </w:t>
-      </w:r>
-      <w:r>
-        <w:t>the</w:t>
-      </w:r>
-      <w:r>
-        <w:rPr>
-          <w:spacing w:val="-6"/>
-        </w:rPr>
-        <w:t xml:space="preserve"> </w:t>
-      </w:r>
-      <w:r>
-        <w:t>loan,</w:t>
-      </w:r>
-      <w:r>
-        <w:rPr>
-          <w:spacing w:val="-7"/>
-        </w:rPr>
-        <w:t xml:space="preserve"> </w:t>
-      </w:r>
-      <w:r>
-        <w:t>in</w:t>
-      </w:r>
-      <w:r>
-        <w:rPr>
-          <w:spacing w:val="-9"/>
-        </w:rPr>
-        <w:t xml:space="preserve"> </w:t>
-      </w:r>
-      <w:r>
-        <w:t>part</w:t>
-      </w:r>
-      <w:r>
-        <w:rPr>
-          <w:spacing w:val="-2"/>
-        </w:rPr>
-        <w:t xml:space="preserve"> </w:t>
-      </w:r>
-      <w:r>
-        <w:t>or</w:t>
-      </w:r>
-      <w:r>
-        <w:rPr>
-          <w:spacing w:val="-7"/>
-        </w:rPr>
-        <w:t xml:space="preserve"> </w:t>
-      </w:r>
-      <w:r>
-        <w:t>in</w:t>
-      </w:r>
-      <w:r>
-        <w:rPr>
-          <w:spacing w:val="-9"/>
-        </w:rPr>
-        <w:t xml:space="preserve"> </w:t>
-      </w:r>
-      <w:r>
-        <w:t>full,</w:t>
-      </w:r>
-      <w:r>
-        <w:rPr>
-          <w:spacing w:val="-13"/>
-        </w:rPr>
-        <w:t xml:space="preserve"> </w:t>
-      </w:r>
-      <w:r>
-        <w:t>at</w:t>
-      </w:r>
-      <w:r>
-        <w:rPr>
-          <w:spacing w:val="-3"/>
-        </w:rPr>
-        <w:t xml:space="preserve"> </w:t>
-      </w:r>
-      <w:r>
-        <w:t>any</w:t>
-      </w:r>
-      <w:r>
-        <w:rPr>
-          <w:spacing w:val="-1"/>
-        </w:rPr>
-        <w:t xml:space="preserve"> </w:t>
-      </w:r>
-      <w:r>
-        <w:t>time</w:t>
-      </w:r>
-      <w:r>
-        <w:rPr>
-          <w:spacing w:val="-7"/>
-        </w:rPr>
-        <w:t xml:space="preserve"> </w:t>
-      </w:r>
-      <w:r>
-        <w:t>prior</w:t>
-      </w:r>
-      <w:r>
-        <w:rPr>
-          <w:spacing w:val="-6"/>
-        </w:rPr>
-        <w:t xml:space="preserve"> </w:t>
-      </w:r>
-      <w:r>
-        <w:t>to</w:t>
-      </w:r>
-      <w:r>
-        <w:rPr>
-          <w:spacing w:val="-9"/>
-        </w:rPr>
-        <w:t xml:space="preserve"> </w:t>
-      </w:r>
-      <w:r>
-        <w:t>the</w:t>
-      </w:r>
-      <w:r>
-        <w:rPr>
-          <w:spacing w:val="-7"/>
-        </w:rPr>
-        <w:t xml:space="preserve"> </w:t>
-      </w:r>
-      <w:r>
-        <w:t>final</w:t>
-      </w:r>
-      <w:r>
-        <w:rPr>
-          <w:spacing w:val="-12"/>
-        </w:rPr>
-        <w:t xml:space="preserve"> </w:t>
-      </w:r>
-      <w:r>
-        <w:t>scheduled payment date without penalty.</w:t>
-      </w:r>
-    </w:p>
-    <w:p>
-      <w:pPr>
-        <w:pStyle w:val="BodyText"/>
-        <w:spacing w:before="1" w:line="259" w:lineRule="auto"/>
-        <w:ind w:left="600" w:right="231"/>
-        <w:jc w:val="both"/>
-        <w:rPr>
-          <w:b/>
-          <w:bCs/>
-        </w:rPr>
-        <w:sectPr>
-          <w:type w:val="continuous"/>
-          <w:pgSz w:w="12240" w:h="15840"/>
-          <w:pgMar w:top="1000" w:right="1080" w:bottom="280" w:left="1080" w:header="720" w:footer="720" w:gutter="0"/>
-          <w:cols w:space="720"/>
-        </w:sectPr>
-      </w:pPr>
-      <w:r>
-        <w:rPr>
-          <w:b/>
-          <w:bCs/>
-        </w:rPr>
-        <w:br/>
-      </w:r>
-    </w:p>
-    <w:p>
-      <w:pPr>
-        <w:pStyle w:val="BodyText"/>
         <w:spacing w:before="13"/>
       </w:pPr>
     </w:p>
@@ -3624,22 +2107,8 @@
         </w:tabs>
         <w:ind w:left="599" w:hanging="239"/>
       </w:pPr>
-      <w:bookmarkStart w:id="6" w:name="6._Governing_Law"/>
-      <w:bookmarkEnd w:id="6"/>
-      <w:r>
-        <w:t>Governing</w:t>
-      </w:r>
-      <w:r>
-        <w:rPr>
-          <w:spacing w:val="-10"/>
-        </w:rPr>
-        <w:t xml:space="preserve"> </w:t>
-      </w:r>
-      <w:r>
-        <w:rPr>
-          <w:spacing w:val="-5"/>
-        </w:rPr>
-        <w:t>Law</w:t>
+      <w:r>
+        <w:t>Prepayment</w:t>
       </w:r>
     </w:p>
     <w:p>
@@ -3649,6 +2118,52 @@
         <w:ind w:left="360"/>
       </w:pPr>
       <w:r>
+        <w:t xml:space="preserve">The Borrower may prepay the loan, in part or in full, at any time prior to the final scheduled payment date without penalty. </w:t>
+      </w:r>
+    </w:p>
+    <w:p>
+      <w:pPr>
+        <w:pStyle w:val="BodyText"/>
+        <w:spacing w:before="13"/>
+      </w:pPr>
+    </w:p>
+    <w:p>
+      <w:pPr>
+        <w:pStyle w:val="Heading1"/>
+        <w:numPr>
+          <w:ilvl w:val="0"/>
+          <w:numId w:val="1"/>
+        </w:numPr>
+        <w:tabs>
+          <w:tab w:val="left" w:pos="599"/>
+        </w:tabs>
+        <w:ind w:left="599" w:hanging="239"/>
+      </w:pPr>
+      <w:bookmarkStart w:id="6" w:name="6._Governing_Law"/>
+      <w:bookmarkEnd w:id="6"/>
+      <w:r>
+        <w:t>Governing</w:t>
+      </w:r>
+      <w:r>
+        <w:rPr>
+          <w:spacing w:val="-10"/>
+        </w:rPr>
+        <w:t xml:space="preserve"> </w:t>
+      </w:r>
+      <w:r>
+        <w:rPr>
+          <w:spacing w:val="-5"/>
+        </w:rPr>
+        <w:t>Law</w:t>
+      </w:r>
+    </w:p>
+    <w:p>
+      <w:pPr>
+        <w:pStyle w:val="BodyText"/>
+        <w:spacing w:before="22"/>
+        <w:ind w:left="360"/>
+      </w:pPr>
+      <w:r>
         <w:t>This</w:t>
       </w:r>
       <w:r>
@@ -3987,21 +2502,6 @@
     <w:p>
       <w:pPr>
         <w:pStyle w:val="Heading1"/>
-      </w:pPr>
-    </w:p>
-    <w:p>
-      <w:pPr>
-        <w:pStyle w:val="BodyText"/>
-        <w:rPr>
-          <w:b/>
-          <w:sz w:val="20"/>
-        </w:rPr>
-      </w:pPr>
-    </w:p>
-    <w:p>
-      <w:pPr>
-        <w:pStyle w:val="Heading1"/>
-        <w:spacing w:line="271" w:lineRule="auto"/>
       </w:pPr>
     </w:p>
     <w:p>
@@ -4022,14 +2522,7 @@
           <w:b/>
           <w:sz w:val="24"/>
         </w:rPr>
-        <w:t>Lender</w:t>
-      </w:r>
-      <w:r>
-        <w:rPr>
-          <w:b/>
-          <w:sz w:val="24"/>
-        </w:rPr>
-        <w:t>:</w:t>
+        <w:t>Lender:</w:t>
       </w:r>
       <w:r>
         <w:rPr>
@@ -4076,18 +2569,6 @@
         </w:rPr>
         <w:t>{{LENDER_NAME}}</w:t>
       </w:r>
-    </w:p>
-    <w:p>
-      <w:pPr>
-        <w:pStyle w:val="Heading1"/>
-        <w:spacing w:line="271" w:lineRule="auto"/>
-      </w:pPr>
-    </w:p>
-    <w:p>
-      <w:pPr>
-        <w:pStyle w:val="Heading1"/>
-        <w:spacing w:line="271" w:lineRule="auto"/>
-      </w:pPr>
     </w:p>
     <w:p>
       <w:pPr>
@@ -4233,7 +2714,7 @@
     </w:p>
     <w:sectPr>
       <w:pgSz w:w="12240" w:h="15840"/>
-      <w:pgMar w:top="1820" w:right="1080" w:bottom="280" w:left="1080" w:header="720" w:footer="720" w:gutter="0"/>
+      <w:pgMar w:top="998" w:right="1077" w:bottom="278" w:left="1077" w:header="720" w:footer="720" w:gutter="0"/>
       <w:cols w:space="720"/>
     </w:sectPr>
   </w:body>
@@ -4291,7 +2772,6 @@
       <w:lvlJc w:val="left"/>
       <w:pPr>
         <w:ind w:left="600" w:hanging="240"/>
-        <w:jc w:val="left"/>
       </w:pPr>
       <w:rPr>
         <w:rFonts w:ascii="Calibri" w:eastAsia="Calibri" w:hAnsi="Calibri" w:cs="Calibri" w:hint="default"/>

</xml_diff>